<commit_message>
- Refactored multiple choice handling - Created definition handling
</commit_message>
<xml_diff>
--- a/sample.docx
+++ b/sample.docx
@@ -38,55 +38,55 @@
       <w:pPr>
         <w:pStyle w:val="Heading2"/>
         <w:numPr>
+          <w:ilvl w:val="0"/>
+          <w:numId w:val="0"/>
+        </w:numPr>
+        <w:ind w:hanging="0" w:start="0"/>
+        <w:rPr>
+          <w:color w:val="000000"/>
+        </w:rPr>
+      </w:pPr>
+      <w:r>
+        <w:rPr>
+          <w:color w:val="000000"/>
+        </w:rPr>
+        <w:t>Multiple Choice</w:t>
+      </w:r>
+    </w:p>
+    <w:p>
+      <w:pPr>
+        <w:pStyle w:val="NoSpacing"/>
+        <w:numPr>
+          <w:ilvl w:val="0"/>
+          <w:numId w:val="3"/>
+        </w:numPr>
+        <w:rPr>
+          <w:color w:val="000000"/>
+        </w:rPr>
+      </w:pPr>
+      <w:r>
+        <w:rPr>
+          <w:b/>
+          <w:bCs/>
+          <w:color w:val="000000"/>
+        </w:rPr>
+        <w:t xml:space="preserve"> </w:t>
+      </w:r>
+      <w:r>
+        <w:rPr>
+          <w:b/>
+          <w:bCs/>
+          <w:color w:val="000000"/>
+        </w:rPr>
+        <w:t>A student refuses to cheat on an exam because CCTV cameras might record the act and lead to suspension.</w:t>
+      </w:r>
+    </w:p>
+    <w:p>
+      <w:pPr>
+        <w:pStyle w:val="NoSpacing"/>
+        <w:numPr>
           <w:ilvl w:val="1"/>
-          <w:numId w:val="1"/>
-        </w:numPr>
-        <w:ind w:hanging="0" w:start="0"/>
-        <w:rPr>
-          <w:color w:val="000000"/>
-        </w:rPr>
-      </w:pPr>
-      <w:r>
-        <w:rPr>
-          <w:color w:val="000000"/>
-        </w:rPr>
-        <w:t>Multiple Choice</w:t>
-      </w:r>
-    </w:p>
-    <w:p>
-      <w:pPr>
-        <w:pStyle w:val="NoSpacing"/>
-        <w:numPr>
-          <w:ilvl w:val="0"/>
-          <w:numId w:val="2"/>
-        </w:numPr>
-        <w:rPr>
-          <w:color w:val="000000"/>
-        </w:rPr>
-      </w:pPr>
-      <w:r>
-        <w:rPr>
-          <w:b/>
-          <w:bCs/>
-          <w:color w:val="000000"/>
-        </w:rPr>
-        <w:t xml:space="preserve"> </w:t>
-      </w:r>
-      <w:r>
-        <w:rPr>
-          <w:b/>
-          <w:bCs/>
-          <w:color w:val="000000"/>
-        </w:rPr>
-        <w:t>A student refuses to cheat on an exam because CCTV cameras might record the act and lead to suspension.</w:t>
-      </w:r>
-    </w:p>
-    <w:p>
-      <w:pPr>
-        <w:pStyle w:val="NoSpacing"/>
-        <w:numPr>
-          <w:ilvl w:val="1"/>
-          <w:numId w:val="2"/>
+          <w:numId w:val="3"/>
         </w:numPr>
         <w:rPr>
           <w:color w:val="000000"/>
@@ -100,8 +100,122 @@
           <w:iCs/>
           <w:color w:val="000000"/>
         </w:rPr>
-        <w:t>***</w:t>
-      </w:r>
+        <w:t>***Stage 1 – Obedience and Punishment</w:t>
+      </w:r>
+    </w:p>
+    <w:p>
+      <w:pPr>
+        <w:pStyle w:val="NoSpacing"/>
+        <w:numPr>
+          <w:ilvl w:val="1"/>
+          <w:numId w:val="3"/>
+        </w:numPr>
+        <w:rPr>
+          <w:color w:val="000000"/>
+        </w:rPr>
+      </w:pPr>
+      <w:r>
+        <w:rPr>
+          <w:b/>
+          <w:bCs/>
+          <w:color w:val="000000"/>
+        </w:rPr>
+        <w:t>Stage 2 – Individualism and Exchange</w:t>
+      </w:r>
+    </w:p>
+    <w:p>
+      <w:pPr>
+        <w:pStyle w:val="NoSpacing"/>
+        <w:numPr>
+          <w:ilvl w:val="1"/>
+          <w:numId w:val="3"/>
+        </w:numPr>
+        <w:rPr>
+          <w:color w:val="000000"/>
+        </w:rPr>
+      </w:pPr>
+      <w:r>
+        <w:rPr>
+          <w:b/>
+          <w:bCs/>
+          <w:color w:val="000000"/>
+        </w:rPr>
+        <w:t>Stage 3 – Good Interpersonal Relationships</w:t>
+      </w:r>
+    </w:p>
+    <w:p>
+      <w:pPr>
+        <w:pStyle w:val="NoSpacing"/>
+        <w:numPr>
+          <w:ilvl w:val="1"/>
+          <w:numId w:val="3"/>
+        </w:numPr>
+        <w:rPr>
+          <w:color w:val="000000"/>
+        </w:rPr>
+      </w:pPr>
+      <w:r>
+        <w:rPr>
+          <w:b/>
+          <w:bCs/>
+          <w:color w:val="000000"/>
+        </w:rPr>
+        <w:t>Stage 4 – Maintaining Social Order</w:t>
+      </w:r>
+    </w:p>
+    <w:p>
+      <w:pPr>
+        <w:pStyle w:val="NoSpacing"/>
+        <w:numPr>
+          <w:ilvl w:val="0"/>
+          <w:numId w:val="0"/>
+        </w:numPr>
+        <w:ind w:hanging="0" w:start="1440"/>
+        <w:rPr>
+          <w:b/>
+          <w:bCs/>
+          <w:color w:val="000000"/>
+        </w:rPr>
+      </w:pPr>
+      <w:r>
+        <w:rPr>
+          <w:b/>
+          <w:bCs/>
+          <w:color w:val="000000"/>
+        </w:rPr>
+      </w:r>
+    </w:p>
+    <w:p>
+      <w:pPr>
+        <w:pStyle w:val="NoSpacing"/>
+        <w:numPr>
+          <w:ilvl w:val="0"/>
+          <w:numId w:val="3"/>
+        </w:numPr>
+        <w:rPr>
+          <w:color w:val="000000"/>
+        </w:rPr>
+      </w:pPr>
+      <w:r>
+        <w:rPr>
+          <w:b/>
+          <w:bCs/>
+          <w:color w:val="000000"/>
+        </w:rPr>
+        <w:t>A student helps a classmate review for an exam but expects the classmate will help them during the next test.</w:t>
+      </w:r>
+    </w:p>
+    <w:p>
+      <w:pPr>
+        <w:pStyle w:val="NoSpacing"/>
+        <w:numPr>
+          <w:ilvl w:val="1"/>
+          <w:numId w:val="3"/>
+        </w:numPr>
+        <w:rPr>
+          <w:color w:val="000000"/>
+        </w:rPr>
+      </w:pPr>
       <w:r>
         <w:rPr>
           <w:b/>
@@ -110,67 +224,67 @@
           <w:iCs/>
           <w:color w:val="000000"/>
         </w:rPr>
+        <w:t>***Stage 2 – Individualism and Exchange</w:t>
+      </w:r>
+    </w:p>
+    <w:p>
+      <w:pPr>
+        <w:pStyle w:val="NoSpacing"/>
+        <w:numPr>
+          <w:ilvl w:val="1"/>
+          <w:numId w:val="3"/>
+        </w:numPr>
+        <w:rPr>
+          <w:color w:val="000000"/>
+        </w:rPr>
+      </w:pPr>
+      <w:r>
+        <w:rPr>
+          <w:b/>
+          <w:bCs/>
+          <w:color w:val="000000"/>
+        </w:rPr>
+        <w:t>Stage 3 – Good Interpersonal Relationships</w:t>
+      </w:r>
+    </w:p>
+    <w:p>
+      <w:pPr>
+        <w:pStyle w:val="NoSpacing"/>
+        <w:numPr>
+          <w:ilvl w:val="1"/>
+          <w:numId w:val="3"/>
+        </w:numPr>
+        <w:rPr>
+          <w:color w:val="000000"/>
+        </w:rPr>
+      </w:pPr>
+      <w:r>
+        <w:rPr>
+          <w:b/>
+          <w:bCs/>
+          <w:color w:val="000000"/>
+        </w:rPr>
+        <w:t>Stage 4 – Maintaining Social Order</w:t>
+      </w:r>
+    </w:p>
+    <w:p>
+      <w:pPr>
+        <w:pStyle w:val="NoSpacing"/>
+        <w:numPr>
+          <w:ilvl w:val="1"/>
+          <w:numId w:val="3"/>
+        </w:numPr>
+        <w:rPr>
+          <w:color w:val="000000"/>
+        </w:rPr>
+      </w:pPr>
+      <w:r>
+        <w:rPr>
+          <w:b/>
+          <w:bCs/>
+          <w:color w:val="000000"/>
+        </w:rPr>
         <w:t>Stage 1 – Obedience and Punishment</w:t>
-      </w:r>
-    </w:p>
-    <w:p>
-      <w:pPr>
-        <w:pStyle w:val="NoSpacing"/>
-        <w:numPr>
-          <w:ilvl w:val="1"/>
-          <w:numId w:val="2"/>
-        </w:numPr>
-        <w:rPr>
-          <w:color w:val="000000"/>
-        </w:rPr>
-      </w:pPr>
-      <w:r>
-        <w:rPr>
-          <w:b/>
-          <w:bCs/>
-          <w:color w:val="000000"/>
-        </w:rPr>
-        <w:t>Stage 2 – Individualism and Exchange</w:t>
-      </w:r>
-    </w:p>
-    <w:p>
-      <w:pPr>
-        <w:pStyle w:val="NoSpacing"/>
-        <w:numPr>
-          <w:ilvl w:val="1"/>
-          <w:numId w:val="2"/>
-        </w:numPr>
-        <w:rPr>
-          <w:color w:val="000000"/>
-        </w:rPr>
-      </w:pPr>
-      <w:r>
-        <w:rPr>
-          <w:b/>
-          <w:bCs/>
-          <w:color w:val="000000"/>
-        </w:rPr>
-        <w:t>Stage 3 – Good Interpersonal Relationships</w:t>
-      </w:r>
-    </w:p>
-    <w:p>
-      <w:pPr>
-        <w:pStyle w:val="NoSpacing"/>
-        <w:numPr>
-          <w:ilvl w:val="1"/>
-          <w:numId w:val="2"/>
-        </w:numPr>
-        <w:rPr>
-          <w:color w:val="000000"/>
-        </w:rPr>
-      </w:pPr>
-      <w:r>
-        <w:rPr>
-          <w:b/>
-          <w:bCs/>
-          <w:color w:val="000000"/>
-        </w:rPr>
-        <w:t>Stage 4 – Maintaining Social Order</w:t>
       </w:r>
     </w:p>
     <w:p>
@@ -200,19 +314,19 @@
         <w:pStyle w:val="NoSpacing"/>
         <w:numPr>
           <w:ilvl w:val="0"/>
-          <w:numId w:val="2"/>
-        </w:numPr>
-        <w:rPr>
-          <w:color w:val="000000"/>
-        </w:rPr>
-      </w:pPr>
-      <w:r>
-        <w:rPr>
-          <w:b/>
-          <w:bCs/>
-          <w:color w:val="000000"/>
-        </w:rPr>
-        <w:t>A student helps a classmate review for an exam but expects the classmate will help them during the next test.</w:t>
+          <w:numId w:val="3"/>
+        </w:numPr>
+        <w:rPr>
+          <w:color w:val="000000"/>
+        </w:rPr>
+      </w:pPr>
+      <w:r>
+        <w:rPr>
+          <w:b/>
+          <w:bCs/>
+          <w:color w:val="000000"/>
+        </w:rPr>
+        <w:t>A government employee refuses to accept a bribe because doing so would violate the law.</w:t>
       </w:r>
     </w:p>
     <w:p>
@@ -220,7 +334,27 @@
         <w:pStyle w:val="NoSpacing"/>
         <w:numPr>
           <w:ilvl w:val="1"/>
-          <w:numId w:val="2"/>
+          <w:numId w:val="3"/>
+        </w:numPr>
+        <w:rPr>
+          <w:color w:val="000000"/>
+        </w:rPr>
+      </w:pPr>
+      <w:r>
+        <w:rPr>
+          <w:b/>
+          <w:bCs/>
+          <w:color w:val="000000"/>
+        </w:rPr>
+        <w:t>Stage 2 – Individualism and Exchange</w:t>
+      </w:r>
+    </w:p>
+    <w:p>
+      <w:pPr>
+        <w:pStyle w:val="NoSpacing"/>
+        <w:numPr>
+          <w:ilvl w:val="1"/>
+          <w:numId w:val="3"/>
         </w:numPr>
         <w:rPr>
           <w:color w:val="000000"/>
@@ -234,8 +368,137 @@
           <w:iCs/>
           <w:color w:val="000000"/>
         </w:rPr>
-        <w:t>***</w:t>
-      </w:r>
+        <w:t>***Stage 4 – Maintaining Social Order</w:t>
+      </w:r>
+    </w:p>
+    <w:p>
+      <w:pPr>
+        <w:pStyle w:val="NoSpacing"/>
+        <w:numPr>
+          <w:ilvl w:val="1"/>
+          <w:numId w:val="3"/>
+        </w:numPr>
+        <w:rPr>
+          <w:color w:val="000000"/>
+        </w:rPr>
+      </w:pPr>
+      <w:r>
+        <w:rPr>
+          <w:b/>
+          <w:bCs/>
+          <w:color w:val="000000"/>
+        </w:rPr>
+        <w:t>Stage 3 – Good Interpersonal Relationships</w:t>
+      </w:r>
+    </w:p>
+    <w:p>
+      <w:pPr>
+        <w:pStyle w:val="NoSpacing"/>
+        <w:numPr>
+          <w:ilvl w:val="1"/>
+          <w:numId w:val="3"/>
+        </w:numPr>
+        <w:rPr>
+          <w:color w:val="000000"/>
+        </w:rPr>
+      </w:pPr>
+      <w:r>
+        <w:rPr>
+          <w:b/>
+          <w:bCs/>
+          <w:color w:val="000000"/>
+        </w:rPr>
+        <w:t>Stage 1 – Obedience and Punishment</w:t>
+      </w:r>
+    </w:p>
+    <w:p>
+      <w:pPr>
+        <w:pStyle w:val="NoSpacing"/>
+        <w:rPr>
+          <w:b/>
+          <w:bCs/>
+          <w:color w:val="000000"/>
+        </w:rPr>
+      </w:pPr>
+      <w:r>
+        <w:rPr>
+          <w:b/>
+          <w:bCs/>
+          <w:color w:val="000000"/>
+        </w:rPr>
+      </w:r>
+    </w:p>
+    <w:p>
+      <w:pPr>
+        <w:pStyle w:val="NoSpacing"/>
+        <w:numPr>
+          <w:ilvl w:val="0"/>
+          <w:numId w:val="3"/>
+        </w:numPr>
+        <w:rPr>
+          <w:color w:val="000000"/>
+        </w:rPr>
+      </w:pPr>
+      <w:r>
+        <w:rPr>
+          <w:b/>
+          <w:bCs/>
+          <w:color w:val="000000"/>
+        </w:rPr>
+        <w:t>A journalist exposes government corruption even though it may cost their job.</w:t>
+      </w:r>
+    </w:p>
+    <w:p>
+      <w:pPr>
+        <w:pStyle w:val="NoSpacing"/>
+        <w:numPr>
+          <w:ilvl w:val="1"/>
+          <w:numId w:val="3"/>
+        </w:numPr>
+        <w:rPr>
+          <w:color w:val="000000"/>
+        </w:rPr>
+      </w:pPr>
+      <w:r>
+        <w:rPr>
+          <w:b/>
+          <w:bCs/>
+          <w:color w:val="000000"/>
+        </w:rPr>
+        <w:t>Stage 3 – Good Interpersonal Relationships</w:t>
+      </w:r>
+    </w:p>
+    <w:p>
+      <w:pPr>
+        <w:pStyle w:val="NoSpacing"/>
+        <w:numPr>
+          <w:ilvl w:val="1"/>
+          <w:numId w:val="3"/>
+        </w:numPr>
+        <w:rPr>
+          <w:color w:val="000000"/>
+        </w:rPr>
+      </w:pPr>
+      <w:r>
+        <w:rPr>
+          <w:b/>
+          <w:bCs/>
+          <w:color w:val="000000"/>
+        </w:rPr>
+        <w:t>Stage 5 – Social Contract</w:t>
+      </w:r>
+    </w:p>
+    <w:p>
+      <w:pPr>
+        <w:pStyle w:val="NoSpacing"/>
+        <w:numPr>
+          <w:ilvl w:val="1"/>
+          <w:numId w:val="3"/>
+        </w:numPr>
+        <w:rPr>
+          <w:color w:val="000000"/>
+        </w:rPr>
+      </w:pPr>
       <w:r>
         <w:rPr>
           <w:b/>
@@ -244,6 +507,103 @@
           <w:iCs/>
           <w:color w:val="000000"/>
         </w:rPr>
+        <w:t>***Stage 6 – Universal Ethical Principles</w:t>
+      </w:r>
+    </w:p>
+    <w:p>
+      <w:pPr>
+        <w:pStyle w:val="NoSpacing"/>
+        <w:numPr>
+          <w:ilvl w:val="1"/>
+          <w:numId w:val="3"/>
+        </w:numPr>
+        <w:rPr>
+          <w:color w:val="000000"/>
+        </w:rPr>
+      </w:pPr>
+      <w:r>
+        <w:rPr>
+          <w:b/>
+          <w:bCs/>
+          <w:color w:val="000000"/>
+        </w:rPr>
+        <w:t>Stage 4 – Maintaining Social Order</w:t>
+      </w:r>
+    </w:p>
+    <w:p>
+      <w:pPr>
+        <w:pStyle w:val="NoSpacing"/>
+        <w:rPr>
+          <w:b/>
+          <w:bCs/>
+          <w:color w:val="000000"/>
+        </w:rPr>
+      </w:pPr>
+      <w:r>
+        <w:rPr>
+          <w:b/>
+          <w:bCs/>
+          <w:color w:val="000000"/>
+        </w:rPr>
+      </w:r>
+    </w:p>
+    <w:p>
+      <w:pPr>
+        <w:pStyle w:val="NoSpacing"/>
+        <w:numPr>
+          <w:ilvl w:val="0"/>
+          <w:numId w:val="3"/>
+        </w:numPr>
+        <w:rPr>
+          <w:color w:val="000000"/>
+        </w:rPr>
+      </w:pPr>
+      <w:r>
+        <w:rPr>
+          <w:b/>
+          <w:bCs/>
+          <w:color w:val="000000"/>
+        </w:rPr>
+        <w:t>A driver stops at a red light only when police officers are nearby.</w:t>
+      </w:r>
+    </w:p>
+    <w:p>
+      <w:pPr>
+        <w:pStyle w:val="NoSpacing"/>
+        <w:numPr>
+          <w:ilvl w:val="1"/>
+          <w:numId w:val="3"/>
+        </w:numPr>
+        <w:rPr>
+          <w:color w:val="000000"/>
+        </w:rPr>
+      </w:pPr>
+      <w:r>
+        <w:rPr>
+          <w:b/>
+          <w:bCs/>
+          <w:color w:val="000000"/>
+        </w:rPr>
+        <w:t>Stage 4 – Maintaining Social Order</w:t>
+      </w:r>
+    </w:p>
+    <w:p>
+      <w:pPr>
+        <w:pStyle w:val="NoSpacing"/>
+        <w:numPr>
+          <w:ilvl w:val="1"/>
+          <w:numId w:val="3"/>
+        </w:numPr>
+        <w:rPr>
+          <w:color w:val="000000"/>
+        </w:rPr>
+      </w:pPr>
+      <w:r>
+        <w:rPr>
+          <w:b/>
+          <w:bCs/>
+          <w:color w:val="000000"/>
+        </w:rPr>
         <w:t>Stage 2 – Individualism and Exchange</w:t>
       </w:r>
     </w:p>
@@ -252,7 +612,7 @@
         <w:pStyle w:val="NoSpacing"/>
         <w:numPr>
           <w:ilvl w:val="1"/>
-          <w:numId w:val="2"/>
+          <w:numId w:val="3"/>
         </w:numPr>
         <w:rPr>
           <w:color w:val="000000"/>
@@ -266,456 +626,46 @@
         </w:rPr>
         <w:t>Stage 3 – Good Interpersonal Relationships</w:t>
       </w:r>
+      <w:r>
+        <w:rPr>
+          <w:b/>
+          <w:bCs/>
+          <w:i/>
+          <w:iCs/>
+          <w:color w:val="000000"/>
+        </w:rPr>
+        <w:t xml:space="preserve"> </w:t>
+      </w:r>
     </w:p>
     <w:p>
       <w:pPr>
         <w:pStyle w:val="NoSpacing"/>
         <w:numPr>
           <w:ilvl w:val="1"/>
-          <w:numId w:val="2"/>
-        </w:numPr>
-        <w:rPr>
-          <w:color w:val="000000"/>
-        </w:rPr>
-      </w:pPr>
-      <w:r>
-        <w:rPr>
-          <w:b/>
-          <w:bCs/>
-          <w:color w:val="000000"/>
-        </w:rPr>
-        <w:t>Stage 4 – Maintaining Social Order</w:t>
-      </w:r>
-    </w:p>
-    <w:p>
-      <w:pPr>
-        <w:pStyle w:val="NoSpacing"/>
-        <w:numPr>
-          <w:ilvl w:val="1"/>
-          <w:numId w:val="2"/>
-        </w:numPr>
-        <w:rPr>
-          <w:color w:val="000000"/>
-        </w:rPr>
-      </w:pPr>
-      <w:r>
-        <w:rPr>
-          <w:b/>
-          <w:bCs/>
-          <w:color w:val="000000"/>
-        </w:rPr>
-        <w:t>Stage 1 – Obedience and Punishment</w:t>
-      </w:r>
-    </w:p>
-    <w:p>
-      <w:pPr>
-        <w:pStyle w:val="NoSpacing"/>
+          <w:numId w:val="3"/>
+        </w:numPr>
+        <w:rPr>
+          <w:color w:val="000000"/>
+        </w:rPr>
+      </w:pPr>
+      <w:r>
+        <w:rPr>
+          <w:b/>
+          <w:bCs/>
+          <w:i/>
+          <w:iCs/>
+          <w:color w:val="000000"/>
+        </w:rPr>
+        <w:t>***Stage 1 – Obedience and Punishment</w:t>
+      </w:r>
+    </w:p>
+    <w:p>
+      <w:pPr>
+        <w:pStyle w:val="Heading2"/>
         <w:numPr>
           <w:ilvl w:val="0"/>
           <w:numId w:val="0"/>
         </w:numPr>
-        <w:ind w:hanging="0" w:start="1440"/>
-        <w:rPr>
-          <w:b/>
-          <w:bCs/>
-          <w:color w:val="000000"/>
-        </w:rPr>
-      </w:pPr>
-      <w:r>
-        <w:rPr>
-          <w:b/>
-          <w:bCs/>
-          <w:color w:val="000000"/>
-        </w:rPr>
-      </w:r>
-    </w:p>
-    <w:p>
-      <w:pPr>
-        <w:pStyle w:val="NoSpacing"/>
-        <w:numPr>
-          <w:ilvl w:val="0"/>
-          <w:numId w:val="2"/>
-        </w:numPr>
-        <w:rPr>
-          <w:color w:val="000000"/>
-        </w:rPr>
-      </w:pPr>
-      <w:r>
-        <w:rPr>
-          <w:b/>
-          <w:bCs/>
-          <w:color w:val="000000"/>
-        </w:rPr>
-        <w:t>A government employee refuses to accept a bribe because doing so would violate the law.</w:t>
-      </w:r>
-    </w:p>
-    <w:p>
-      <w:pPr>
-        <w:pStyle w:val="NoSpacing"/>
-        <w:numPr>
-          <w:ilvl w:val="1"/>
-          <w:numId w:val="2"/>
-        </w:numPr>
-        <w:rPr>
-          <w:color w:val="000000"/>
-        </w:rPr>
-      </w:pPr>
-      <w:r>
-        <w:rPr>
-          <w:b/>
-          <w:bCs/>
-          <w:color w:val="000000"/>
-        </w:rPr>
-        <w:t>Stage 2 – Individualism and Exchange</w:t>
-      </w:r>
-    </w:p>
-    <w:p>
-      <w:pPr>
-        <w:pStyle w:val="NoSpacing"/>
-        <w:numPr>
-          <w:ilvl w:val="1"/>
-          <w:numId w:val="2"/>
-        </w:numPr>
-        <w:rPr>
-          <w:color w:val="000000"/>
-        </w:rPr>
-      </w:pPr>
-      <w:r>
-        <w:rPr>
-          <w:b/>
-          <w:bCs/>
-          <w:i/>
-          <w:iCs/>
-          <w:color w:val="000000"/>
-        </w:rPr>
-        <w:t>***</w:t>
-      </w:r>
-      <w:r>
-        <w:rPr>
-          <w:b/>
-          <w:bCs/>
-          <w:i/>
-          <w:iCs/>
-          <w:color w:val="000000"/>
-        </w:rPr>
-        <w:t>Stage 4 – Maintaining Social Order</w:t>
-      </w:r>
-    </w:p>
-    <w:p>
-      <w:pPr>
-        <w:pStyle w:val="NoSpacing"/>
-        <w:numPr>
-          <w:ilvl w:val="1"/>
-          <w:numId w:val="2"/>
-        </w:numPr>
-        <w:rPr>
-          <w:color w:val="000000"/>
-        </w:rPr>
-      </w:pPr>
-      <w:r>
-        <w:rPr>
-          <w:b/>
-          <w:bCs/>
-          <w:color w:val="000000"/>
-        </w:rPr>
-        <w:t>Stage 3 – Good Interpersonal Relationships</w:t>
-      </w:r>
-    </w:p>
-    <w:p>
-      <w:pPr>
-        <w:pStyle w:val="NoSpacing"/>
-        <w:numPr>
-          <w:ilvl w:val="1"/>
-          <w:numId w:val="2"/>
-        </w:numPr>
-        <w:rPr>
-          <w:color w:val="000000"/>
-        </w:rPr>
-      </w:pPr>
-      <w:r>
-        <w:rPr>
-          <w:b/>
-          <w:bCs/>
-          <w:color w:val="000000"/>
-        </w:rPr>
-        <w:t>Stage 1 – Obedience and Punishment</w:t>
-      </w:r>
-    </w:p>
-    <w:p>
-      <w:pPr>
-        <w:pStyle w:val="NoSpacing"/>
-        <w:rPr>
-          <w:b/>
-          <w:bCs/>
-          <w:color w:val="000000"/>
-        </w:rPr>
-      </w:pPr>
-      <w:r>
-        <w:rPr>
-          <w:b/>
-          <w:bCs/>
-          <w:color w:val="000000"/>
-        </w:rPr>
-      </w:r>
-    </w:p>
-    <w:p>
-      <w:pPr>
-        <w:pStyle w:val="NoSpacing"/>
-        <w:numPr>
-          <w:ilvl w:val="0"/>
-          <w:numId w:val="2"/>
-        </w:numPr>
-        <w:rPr>
-          <w:color w:val="000000"/>
-        </w:rPr>
-      </w:pPr>
-      <w:r>
-        <w:rPr>
-          <w:b/>
-          <w:bCs/>
-          <w:color w:val="000000"/>
-        </w:rPr>
-        <w:t>A journalist exposes government corruption even though it may cost their job.</w:t>
-      </w:r>
-    </w:p>
-    <w:p>
-      <w:pPr>
-        <w:pStyle w:val="NoSpacing"/>
-        <w:numPr>
-          <w:ilvl w:val="1"/>
-          <w:numId w:val="2"/>
-        </w:numPr>
-        <w:rPr>
-          <w:color w:val="000000"/>
-        </w:rPr>
-      </w:pPr>
-      <w:r>
-        <w:rPr>
-          <w:b/>
-          <w:bCs/>
-          <w:color w:val="000000"/>
-        </w:rPr>
-        <w:t>Stage 3 – Good Interpersonal Relationships</w:t>
-      </w:r>
-    </w:p>
-    <w:p>
-      <w:pPr>
-        <w:pStyle w:val="NoSpacing"/>
-        <w:numPr>
-          <w:ilvl w:val="1"/>
-          <w:numId w:val="2"/>
-        </w:numPr>
-        <w:rPr>
-          <w:color w:val="000000"/>
-        </w:rPr>
-      </w:pPr>
-      <w:r>
-        <w:rPr>
-          <w:b/>
-          <w:bCs/>
-          <w:color w:val="000000"/>
-        </w:rPr>
-        <w:t>Stage 5 – Social Contract</w:t>
-      </w:r>
-    </w:p>
-    <w:p>
-      <w:pPr>
-        <w:pStyle w:val="NoSpacing"/>
-        <w:numPr>
-          <w:ilvl w:val="1"/>
-          <w:numId w:val="2"/>
-        </w:numPr>
-        <w:rPr>
-          <w:color w:val="000000"/>
-        </w:rPr>
-      </w:pPr>
-      <w:r>
-        <w:rPr>
-          <w:b/>
-          <w:bCs/>
-          <w:i/>
-          <w:iCs/>
-          <w:color w:val="000000"/>
-        </w:rPr>
-        <w:t>***</w:t>
-      </w:r>
-      <w:r>
-        <w:rPr>
-          <w:b/>
-          <w:bCs/>
-          <w:i/>
-          <w:iCs/>
-          <w:color w:val="000000"/>
-        </w:rPr>
-        <w:t>Stage 6 – Universal Ethical Principles</w:t>
-      </w:r>
-    </w:p>
-    <w:p>
-      <w:pPr>
-        <w:pStyle w:val="NoSpacing"/>
-        <w:numPr>
-          <w:ilvl w:val="1"/>
-          <w:numId w:val="2"/>
-        </w:numPr>
-        <w:rPr>
-          <w:color w:val="000000"/>
-        </w:rPr>
-      </w:pPr>
-      <w:r>
-        <w:rPr>
-          <w:b/>
-          <w:bCs/>
-          <w:color w:val="000000"/>
-        </w:rPr>
-        <w:t>Stage 4 – Maintaining Social Order</w:t>
-      </w:r>
-    </w:p>
-    <w:p>
-      <w:pPr>
-        <w:pStyle w:val="NoSpacing"/>
-        <w:rPr>
-          <w:b/>
-          <w:bCs/>
-          <w:color w:val="000000"/>
-        </w:rPr>
-      </w:pPr>
-      <w:r>
-        <w:rPr>
-          <w:b/>
-          <w:bCs/>
-          <w:color w:val="000000"/>
-        </w:rPr>
-      </w:r>
-    </w:p>
-    <w:p>
-      <w:pPr>
-        <w:pStyle w:val="NoSpacing"/>
-        <w:numPr>
-          <w:ilvl w:val="0"/>
-          <w:numId w:val="2"/>
-        </w:numPr>
-        <w:rPr>
-          <w:color w:val="000000"/>
-        </w:rPr>
-      </w:pPr>
-      <w:r>
-        <w:rPr>
-          <w:b/>
-          <w:bCs/>
-          <w:color w:val="000000"/>
-        </w:rPr>
-        <w:t>A driver stops at a red light only when police officers are nearby.</w:t>
-      </w:r>
-    </w:p>
-    <w:p>
-      <w:pPr>
-        <w:pStyle w:val="NoSpacing"/>
-        <w:numPr>
-          <w:ilvl w:val="1"/>
-          <w:numId w:val="2"/>
-        </w:numPr>
-        <w:rPr>
-          <w:color w:val="000000"/>
-        </w:rPr>
-      </w:pPr>
-      <w:r>
-        <w:rPr>
-          <w:b/>
-          <w:bCs/>
-          <w:color w:val="000000"/>
-        </w:rPr>
-        <w:t>Stage 4 – Maintaining Social Order</w:t>
-      </w:r>
-    </w:p>
-    <w:p>
-      <w:pPr>
-        <w:pStyle w:val="NoSpacing"/>
-        <w:numPr>
-          <w:ilvl w:val="1"/>
-          <w:numId w:val="2"/>
-        </w:numPr>
-        <w:rPr>
-          <w:color w:val="000000"/>
-        </w:rPr>
-      </w:pPr>
-      <w:r>
-        <w:rPr>
-          <w:b/>
-          <w:bCs/>
-          <w:color w:val="000000"/>
-        </w:rPr>
-        <w:t>Stage 2 – Individualism and Exchange</w:t>
-      </w:r>
-    </w:p>
-    <w:p>
-      <w:pPr>
-        <w:pStyle w:val="NoSpacing"/>
-        <w:numPr>
-          <w:ilvl w:val="1"/>
-          <w:numId w:val="2"/>
-        </w:numPr>
-        <w:rPr>
-          <w:color w:val="000000"/>
-        </w:rPr>
-      </w:pPr>
-      <w:r>
-        <w:rPr>
-          <w:b/>
-          <w:bCs/>
-          <w:color w:val="000000"/>
-        </w:rPr>
-        <w:t>Stage 3 – Good Interpersonal Relationships</w:t>
-      </w:r>
-      <w:r>
-        <w:rPr>
-          <w:b/>
-          <w:bCs/>
-          <w:i/>
-          <w:iCs/>
-          <w:color w:val="000000"/>
-        </w:rPr>
-        <w:t xml:space="preserve"> </w:t>
-      </w:r>
-    </w:p>
-    <w:p>
-      <w:pPr>
-        <w:pStyle w:val="NoSpacing"/>
-        <w:numPr>
-          <w:ilvl w:val="1"/>
-          <w:numId w:val="2"/>
-        </w:numPr>
-        <w:rPr>
-          <w:color w:val="000000"/>
-        </w:rPr>
-      </w:pPr>
-      <w:r>
-        <w:rPr>
-          <w:b/>
-          <w:bCs/>
-          <w:i/>
-          <w:iCs/>
-          <w:color w:val="000000"/>
-        </w:rPr>
-        <w:t>***</w:t>
-      </w:r>
-      <w:r>
-        <w:rPr>
-          <w:b/>
-          <w:bCs/>
-          <w:i/>
-          <w:iCs/>
-          <w:color w:val="000000"/>
-        </w:rPr>
-        <w:t>Stage 1 – Obedience and Punishment</w:t>
-      </w:r>
-    </w:p>
-    <w:p>
-      <w:pPr>
-        <w:pStyle w:val="Heading2"/>
-        <w:numPr>
-          <w:ilvl w:val="1"/>
-          <w:numId w:val="1"/>
-        </w:numPr>
         <w:spacing w:before="200" w:after="120"/>
         <w:ind w:hanging="0" w:start="0"/>
         <w:rPr>
@@ -727,6 +677,44 @@
           <w:color w:val="000000"/>
         </w:rPr>
         <w:t>Definition</w:t>
+      </w:r>
+    </w:p>
+    <w:p>
+      <w:pPr>
+        <w:pStyle w:val="NoSpacing"/>
+        <w:numPr>
+          <w:ilvl w:val="0"/>
+          <w:numId w:val="4"/>
+        </w:numPr>
+        <w:rPr>
+          <w:color w:val="000000"/>
+        </w:rPr>
+      </w:pPr>
+      <w:r>
+        <w:rPr>
+          <w:b/>
+          <w:bCs/>
+        </w:rPr>
+        <w:t>A journalist exposes government corruption even though it may cost their job.</w:t>
+      </w:r>
+    </w:p>
+    <w:p>
+      <w:pPr>
+        <w:pStyle w:val="NoSpacing"/>
+        <w:numPr>
+          <w:ilvl w:val="0"/>
+          <w:numId w:val="4"/>
+        </w:numPr>
+        <w:rPr>
+          <w:color w:val="000000"/>
+        </w:rPr>
+      </w:pPr>
+      <w:r>
+        <w:rPr>
+          <w:b/>
+          <w:bCs/>
+        </w:rPr>
+        <w:t>Hello world! This is a sample question...</w:t>
       </w:r>
     </w:p>
     <w:sectPr>
@@ -757,7 +745,6 @@
         </w:tabs>
         <w:ind w:start="0" w:hanging="0"/>
       </w:pPr>
-      <w:rPr/>
     </w:lvl>
     <w:lvl w:ilvl="1">
       <w:start w:val="1"/>
@@ -771,7 +758,6 @@
         </w:tabs>
         <w:ind w:start="0" w:hanging="0"/>
       </w:pPr>
-      <w:rPr/>
     </w:lvl>
     <w:lvl w:ilvl="2">
       <w:start w:val="1"/>
@@ -785,7 +771,6 @@
         </w:tabs>
         <w:ind w:start="0" w:hanging="0"/>
       </w:pPr>
-      <w:rPr/>
     </w:lvl>
     <w:lvl w:ilvl="3">
       <w:start w:val="1"/>
@@ -799,7 +784,6 @@
         </w:tabs>
         <w:ind w:start="0" w:hanging="0"/>
       </w:pPr>
-      <w:rPr/>
     </w:lvl>
     <w:lvl w:ilvl="4">
       <w:start w:val="1"/>
@@ -813,7 +797,6 @@
         </w:tabs>
         <w:ind w:start="0" w:hanging="0"/>
       </w:pPr>
-      <w:rPr/>
     </w:lvl>
     <w:lvl w:ilvl="5">
       <w:start w:val="1"/>
@@ -827,7 +810,6 @@
         </w:tabs>
         <w:ind w:start="0" w:hanging="0"/>
       </w:pPr>
-      <w:rPr/>
     </w:lvl>
     <w:lvl w:ilvl="6">
       <w:start w:val="1"/>
@@ -841,7 +823,6 @@
         </w:tabs>
         <w:ind w:start="0" w:hanging="0"/>
       </w:pPr>
-      <w:rPr/>
     </w:lvl>
     <w:lvl w:ilvl="7">
       <w:start w:val="1"/>
@@ -855,7 +836,6 @@
         </w:tabs>
         <w:ind w:start="0" w:hanging="0"/>
       </w:pPr>
-      <w:rPr/>
     </w:lvl>
     <w:lvl w:ilvl="8">
       <w:start w:val="1"/>
@@ -869,7 +849,6 @@
         </w:tabs>
         <w:ind w:start="0" w:hanging="0"/>
       </w:pPr>
-      <w:rPr/>
     </w:lvl>
   </w:abstractNum>
   <w:abstractNum w:abstractNumId="2">
@@ -880,6 +859,137 @@
       <w:lvlJc w:val="start"/>
       <w:pPr>
         <w:tabs>
+          <w:tab w:val="num" w:pos="720"/>
+        </w:tabs>
+        <w:ind w:start="720" w:hanging="360"/>
+      </w:pPr>
+      <w:rPr/>
+    </w:lvl>
+    <w:lvl w:ilvl="1">
+      <w:start w:val="1"/>
+      <w:numFmt w:val="decimal"/>
+      <w:lvlText w:val="%1.%2."/>
+      <w:lvlJc w:val="start"/>
+      <w:pPr>
+        <w:tabs>
+          <w:tab w:val="num" w:pos="1080"/>
+        </w:tabs>
+        <w:ind w:start="1080" w:hanging="360"/>
+      </w:pPr>
+      <w:rPr/>
+    </w:lvl>
+    <w:lvl w:ilvl="2">
+      <w:start w:val="1"/>
+      <w:numFmt w:val="lowerLetter"/>
+      <w:lvlText w:val="%3)"/>
+      <w:lvlJc w:val="start"/>
+      <w:pPr>
+        <w:tabs>
+          <w:tab w:val="num" w:pos="1440"/>
+        </w:tabs>
+        <w:ind w:start="1440" w:hanging="360"/>
+      </w:pPr>
+      <w:rPr/>
+    </w:lvl>
+    <w:lvl w:ilvl="3">
+      <w:start w:val="1"/>
+      <w:numFmt w:val="bullet"/>
+      <w:lvlText w:val=""/>
+      <w:lvlJc w:val="start"/>
+      <w:pPr>
+        <w:tabs>
+          <w:tab w:val="num" w:pos="1800"/>
+        </w:tabs>
+        <w:ind w:start="1800" w:hanging="360"/>
+      </w:pPr>
+      <w:rPr>
+        <w:rFonts w:ascii="Symbol" w:hAnsi="Symbol" w:cs="Symbol" w:hint="default"/>
+      </w:rPr>
+    </w:lvl>
+    <w:lvl w:ilvl="4">
+      <w:start w:val="1"/>
+      <w:numFmt w:val="bullet"/>
+      <w:lvlText w:val=""/>
+      <w:lvlJc w:val="start"/>
+      <w:pPr>
+        <w:tabs>
+          <w:tab w:val="num" w:pos="2160"/>
+        </w:tabs>
+        <w:ind w:start="2160" w:hanging="360"/>
+      </w:pPr>
+      <w:rPr>
+        <w:rFonts w:ascii="Symbol" w:hAnsi="Symbol" w:cs="Symbol" w:hint="default"/>
+      </w:rPr>
+    </w:lvl>
+    <w:lvl w:ilvl="5">
+      <w:start w:val="1"/>
+      <w:numFmt w:val="bullet"/>
+      <w:lvlText w:val=""/>
+      <w:lvlJc w:val="start"/>
+      <w:pPr>
+        <w:tabs>
+          <w:tab w:val="num" w:pos="2520"/>
+        </w:tabs>
+        <w:ind w:start="2520" w:hanging="360"/>
+      </w:pPr>
+      <w:rPr>
+        <w:rFonts w:ascii="Symbol" w:hAnsi="Symbol" w:cs="Symbol" w:hint="default"/>
+      </w:rPr>
+    </w:lvl>
+    <w:lvl w:ilvl="6">
+      <w:start w:val="1"/>
+      <w:numFmt w:val="bullet"/>
+      <w:lvlText w:val=""/>
+      <w:lvlJc w:val="start"/>
+      <w:pPr>
+        <w:tabs>
+          <w:tab w:val="num" w:pos="2880"/>
+        </w:tabs>
+        <w:ind w:start="2880" w:hanging="360"/>
+      </w:pPr>
+      <w:rPr>
+        <w:rFonts w:ascii="Symbol" w:hAnsi="Symbol" w:cs="Symbol" w:hint="default"/>
+      </w:rPr>
+    </w:lvl>
+    <w:lvl w:ilvl="7">
+      <w:start w:val="1"/>
+      <w:numFmt w:val="bullet"/>
+      <w:lvlText w:val=""/>
+      <w:lvlJc w:val="start"/>
+      <w:pPr>
+        <w:tabs>
+          <w:tab w:val="num" w:pos="3240"/>
+        </w:tabs>
+        <w:ind w:start="3240" w:hanging="360"/>
+      </w:pPr>
+      <w:rPr>
+        <w:rFonts w:ascii="Symbol" w:hAnsi="Symbol" w:cs="Symbol" w:hint="default"/>
+      </w:rPr>
+    </w:lvl>
+    <w:lvl w:ilvl="8">
+      <w:start w:val="1"/>
+      <w:numFmt w:val="bullet"/>
+      <w:lvlText w:val=""/>
+      <w:lvlJc w:val="start"/>
+      <w:pPr>
+        <w:tabs>
+          <w:tab w:val="num" w:pos="3600"/>
+        </w:tabs>
+        <w:ind w:start="3600" w:hanging="360"/>
+      </w:pPr>
+      <w:rPr>
+        <w:rFonts w:ascii="Symbol" w:hAnsi="Symbol" w:cs="Symbol" w:hint="default"/>
+      </w:rPr>
+    </w:lvl>
+  </w:abstractNum>
+  <w:abstractNum w:abstractNumId="3">
+    <w:lvl w:ilvl="0">
+      <w:start w:val="1"/>
+      <w:numFmt w:val="decimal"/>
+      <w:lvlText w:val="%1."/>
+      <w:lvlJc w:val="start"/>
+      <w:pPr>
+        <w:tabs>
           <w:tab w:val="num" w:pos="0"/>
         </w:tabs>
         <w:ind w:start="720" w:hanging="360"/>
@@ -991,123 +1101,123 @@
       <w:rPr/>
     </w:lvl>
   </w:abstractNum>
-  <w:abstractNum w:abstractNumId="3">
+  <w:abstractNum w:abstractNumId="4">
     <w:lvl w:ilvl="0">
       <w:start w:val="1"/>
-      <w:numFmt w:val="none"/>
-      <w:suff w:val="nothing"/>
-      <w:lvlText w:val=""/>
-      <w:lvlJc w:val="start"/>
-      <w:pPr>
-        <w:tabs>
-          <w:tab w:val="num" w:pos="0"/>
-        </w:tabs>
-        <w:ind w:start="0" w:hanging="0"/>
-      </w:pPr>
+      <w:numFmt w:val="decimal"/>
+      <w:lvlText w:val="%1"/>
+      <w:lvlJc w:val="start"/>
+      <w:pPr>
+        <w:tabs>
+          <w:tab w:val="num" w:pos="720"/>
+        </w:tabs>
+        <w:ind w:start="720" w:hanging="360"/>
+      </w:pPr>
+      <w:rPr/>
     </w:lvl>
     <w:lvl w:ilvl="1">
       <w:start w:val="1"/>
-      <w:numFmt w:val="none"/>
-      <w:suff w:val="nothing"/>
-      <w:lvlText w:val=""/>
-      <w:lvlJc w:val="start"/>
-      <w:pPr>
-        <w:tabs>
-          <w:tab w:val="num" w:pos="0"/>
-        </w:tabs>
-        <w:ind w:start="0" w:hanging="0"/>
-      </w:pPr>
+      <w:numFmt w:val="decimal"/>
+      <w:lvlText w:val="%1.%2"/>
+      <w:lvlJc w:val="start"/>
+      <w:pPr>
+        <w:tabs>
+          <w:tab w:val="num" w:pos="1080"/>
+        </w:tabs>
+        <w:ind w:start="1080" w:hanging="360"/>
+      </w:pPr>
+      <w:rPr/>
     </w:lvl>
     <w:lvl w:ilvl="2">
       <w:start w:val="1"/>
-      <w:numFmt w:val="none"/>
-      <w:suff w:val="nothing"/>
-      <w:lvlText w:val=""/>
-      <w:lvlJc w:val="start"/>
-      <w:pPr>
-        <w:tabs>
-          <w:tab w:val="num" w:pos="0"/>
-        </w:tabs>
-        <w:ind w:start="0" w:hanging="0"/>
-      </w:pPr>
+      <w:numFmt w:val="decimal"/>
+      <w:lvlText w:val="%1.%2.%3"/>
+      <w:lvlJc w:val="start"/>
+      <w:pPr>
+        <w:tabs>
+          <w:tab w:val="num" w:pos="1440"/>
+        </w:tabs>
+        <w:ind w:start="1440" w:hanging="360"/>
+      </w:pPr>
+      <w:rPr/>
     </w:lvl>
     <w:lvl w:ilvl="3">
       <w:start w:val="1"/>
-      <w:numFmt w:val="none"/>
-      <w:suff w:val="nothing"/>
-      <w:lvlText w:val=""/>
-      <w:lvlJc w:val="start"/>
-      <w:pPr>
-        <w:tabs>
-          <w:tab w:val="num" w:pos="0"/>
-        </w:tabs>
-        <w:ind w:start="0" w:hanging="0"/>
-      </w:pPr>
+      <w:numFmt w:val="decimal"/>
+      <w:lvlText w:val="%1.%2.%3.%4"/>
+      <w:lvlJc w:val="start"/>
+      <w:pPr>
+        <w:tabs>
+          <w:tab w:val="num" w:pos="1800"/>
+        </w:tabs>
+        <w:ind w:start="1800" w:hanging="360"/>
+      </w:pPr>
+      <w:rPr/>
     </w:lvl>
     <w:lvl w:ilvl="4">
       <w:start w:val="1"/>
-      <w:numFmt w:val="none"/>
-      <w:suff w:val="nothing"/>
-      <w:lvlText w:val=""/>
-      <w:lvlJc w:val="start"/>
-      <w:pPr>
-        <w:tabs>
-          <w:tab w:val="num" w:pos="0"/>
-        </w:tabs>
-        <w:ind w:start="0" w:hanging="0"/>
-      </w:pPr>
+      <w:numFmt w:val="decimal"/>
+      <w:lvlText w:val="%1.%2.%3.%4.%5"/>
+      <w:lvlJc w:val="start"/>
+      <w:pPr>
+        <w:tabs>
+          <w:tab w:val="num" w:pos="2160"/>
+        </w:tabs>
+        <w:ind w:start="2160" w:hanging="360"/>
+      </w:pPr>
+      <w:rPr/>
     </w:lvl>
     <w:lvl w:ilvl="5">
       <w:start w:val="1"/>
-      <w:numFmt w:val="none"/>
-      <w:suff w:val="nothing"/>
-      <w:lvlText w:val=""/>
-      <w:lvlJc w:val="start"/>
-      <w:pPr>
-        <w:tabs>
-          <w:tab w:val="num" w:pos="0"/>
-        </w:tabs>
-        <w:ind w:start="0" w:hanging="0"/>
-      </w:pPr>
+      <w:numFmt w:val="decimal"/>
+      <w:lvlText w:val="%1.%2.%3.%4.%5.%6"/>
+      <w:lvlJc w:val="start"/>
+      <w:pPr>
+        <w:tabs>
+          <w:tab w:val="num" w:pos="2520"/>
+        </w:tabs>
+        <w:ind w:start="2520" w:hanging="360"/>
+      </w:pPr>
+      <w:rPr/>
     </w:lvl>
     <w:lvl w:ilvl="6">
       <w:start w:val="1"/>
-      <w:numFmt w:val="none"/>
-      <w:suff w:val="nothing"/>
-      <w:lvlText w:val=""/>
-      <w:lvlJc w:val="start"/>
-      <w:pPr>
-        <w:tabs>
-          <w:tab w:val="num" w:pos="0"/>
-        </w:tabs>
-        <w:ind w:start="0" w:hanging="0"/>
-      </w:pPr>
+      <w:numFmt w:val="decimal"/>
+      <w:lvlText w:val="%1.%2.%3.%4.%5.%6.%7"/>
+      <w:lvlJc w:val="start"/>
+      <w:pPr>
+        <w:tabs>
+          <w:tab w:val="num" w:pos="2880"/>
+        </w:tabs>
+        <w:ind w:start="2880" w:hanging="360"/>
+      </w:pPr>
+      <w:rPr/>
     </w:lvl>
     <w:lvl w:ilvl="7">
       <w:start w:val="1"/>
-      <w:numFmt w:val="none"/>
-      <w:suff w:val="nothing"/>
-      <w:lvlText w:val=""/>
-      <w:lvlJc w:val="start"/>
-      <w:pPr>
-        <w:tabs>
-          <w:tab w:val="num" w:pos="0"/>
-        </w:tabs>
-        <w:ind w:start="0" w:hanging="0"/>
-      </w:pPr>
+      <w:numFmt w:val="decimal"/>
+      <w:lvlText w:val="%1.%2.%3.%4.%5.%6.%7.%8"/>
+      <w:lvlJc w:val="start"/>
+      <w:pPr>
+        <w:tabs>
+          <w:tab w:val="num" w:pos="3240"/>
+        </w:tabs>
+        <w:ind w:start="3240" w:hanging="360"/>
+      </w:pPr>
+      <w:rPr/>
     </w:lvl>
     <w:lvl w:ilvl="8">
       <w:start w:val="1"/>
-      <w:numFmt w:val="none"/>
-      <w:suff w:val="nothing"/>
-      <w:lvlText w:val=""/>
-      <w:lvlJc w:val="start"/>
-      <w:pPr>
-        <w:tabs>
-          <w:tab w:val="num" w:pos="0"/>
-        </w:tabs>
-        <w:ind w:start="0" w:hanging="0"/>
-      </w:pPr>
+      <w:numFmt w:val="decimal"/>
+      <w:lvlText w:val="%1.%2.%3.%4.%5.%6.%7.%8.%9"/>
+      <w:lvlJc w:val="start"/>
+      <w:pPr>
+        <w:tabs>
+          <w:tab w:val="num" w:pos="3600"/>
+        </w:tabs>
+        <w:ind w:start="3600" w:hanging="360"/>
+      </w:pPr>
+      <w:rPr/>
     </w:lvl>
   </w:abstractNum>
   <w:num w:numId="1">
@@ -1118,6 +1228,9 @@
   </w:num>
   <w:num w:numId="3">
     <w:abstractNumId w:val="3"/>
+  </w:num>
+  <w:num w:numId="4">
+    <w:abstractNumId w:val="4"/>
   </w:num>
 </w:numbering>
 </file>
@@ -1539,7 +1652,7 @@
     <w:pPr>
       <w:numPr>
         <w:ilvl w:val="1"/>
-        <w:numId w:val="1"/>
+        <w:numId w:val="2"/>
       </w:numPr>
       <w:spacing w:before="200" w:after="120"/>
       <w:outlineLvl w:val="1"/>
@@ -1556,6 +1669,18 @@
     <w:uiPriority w:val="1"/>
     <w:semiHidden/>
     <w:unhideWhenUsed/>
+    <w:qFormat/>
+    <w:rPr/>
+  </w:style>
+  <w:style w:type="character" w:styleId="Bullets">
+    <w:name w:val="Bullets"/>
+    <w:qFormat/>
+    <w:rPr>
+      <w:rFonts w:ascii="OpenSymbol" w:hAnsi="OpenSymbol" w:eastAsia="OpenSymbol" w:cs="OpenSymbol"/>
+    </w:rPr>
+  </w:style>
+  <w:style w:type="character" w:styleId="NumberingSymbols">
+    <w:name w:val="Numbering Symbols"/>
     <w:qFormat/>
     <w:rPr/>
   </w:style>

</xml_diff>

<commit_message>
- Handle essay - Handle definition - Init: Handle true/false
</commit_message>
<xml_diff>
--- a/sample.docx
+++ b/sample.docx
@@ -714,7 +714,129 @@
           <w:b/>
           <w:bCs/>
         </w:rPr>
-        <w:t>Hello world! This is a sample question...</w:t>
+        <w:t>Hello world! This is a sample question…</w:t>
+      </w:r>
+    </w:p>
+    <w:p>
+      <w:pPr>
+        <w:pStyle w:val="Heading2"/>
+        <w:numPr>
+          <w:ilvl w:val="0"/>
+          <w:numId w:val="0"/>
+        </w:numPr>
+        <w:spacing w:before="200" w:after="120"/>
+        <w:ind w:hanging="0" w:start="0"/>
+        <w:rPr>
+          <w:color w:val="000000"/>
+        </w:rPr>
+      </w:pPr>
+      <w:r>
+        <w:rPr/>
+        <w:t>Essay</w:t>
+      </w:r>
+    </w:p>
+    <w:p>
+      <w:pPr>
+        <w:pStyle w:val="BodyText"/>
+        <w:numPr>
+          <w:ilvl w:val="0"/>
+          <w:numId w:val="5"/>
+        </w:numPr>
+        <w:spacing w:before="200" w:after="120"/>
+        <w:rPr>
+          <w:color w:val="000000"/>
+        </w:rPr>
+      </w:pPr>
+      <w:r>
+        <w:rPr/>
+        <w:t>This is an essay. Lorem Ipsum is simply dummy text of the printing and typesetting industry. Lorem Ipsum has been the industry's standard dummy text ever since the 1500s, when an unknown printer took a galley of type and scrambled it to make a type specimen book. It has survived not only five centuries, but also the leap into electronic typesetting, remaining essentially unchanged. It was popularised in the 1960s with the release of Letraset sheets containing Lorem Ipsum passages, and more recently with desktop publishing software like Aldus PageMaker including versions of Lorem Ipsum.</w:t>
+      </w:r>
+    </w:p>
+    <w:p>
+      <w:pPr>
+        <w:pStyle w:val="Heading2"/>
+        <w:numPr>
+          <w:ilvl w:val="0"/>
+          <w:numId w:val="0"/>
+        </w:numPr>
+        <w:rPr/>
+      </w:pPr>
+      <w:r>
+        <w:rPr/>
+        <w:t>True/False</w:t>
+      </w:r>
+    </w:p>
+    <w:p>
+      <w:pPr>
+        <w:pStyle w:val="BodyText"/>
+        <w:numPr>
+          <w:ilvl w:val="0"/>
+          <w:numId w:val="6"/>
+        </w:numPr>
+        <w:rPr/>
+      </w:pPr>
+      <w:r>
+        <w:rPr/>
+        <w:t>Asdsad</w:t>
+      </w:r>
+    </w:p>
+    <w:p>
+      <w:pPr>
+        <w:pStyle w:val="BodyText"/>
+        <w:numPr>
+          <w:ilvl w:val="0"/>
+          <w:numId w:val="6"/>
+        </w:numPr>
+        <w:rPr/>
+      </w:pPr>
+      <w:r>
+        <w:rPr/>
+        <w:t>sadddd</w:t>
+      </w:r>
+    </w:p>
+    <w:p>
+      <w:pPr>
+        <w:pStyle w:val="BodyText"/>
+        <w:numPr>
+          <w:ilvl w:val="0"/>
+          <w:numId w:val="6"/>
+        </w:numPr>
+        <w:rPr/>
+      </w:pPr>
+      <w:r>
+        <w:rPr/>
+        <w:t>zzzz123</w:t>
+      </w:r>
+    </w:p>
+    <w:p>
+      <w:pPr>
+        <w:pStyle w:val="BodyText"/>
+        <w:numPr>
+          <w:ilvl w:val="0"/>
+          <w:numId w:val="6"/>
+        </w:numPr>
+        <w:rPr/>
+      </w:pPr>
+      <w:r>
+        <w:rPr/>
+        <w:t>12313131231</w:t>
+      </w:r>
+    </w:p>
+    <w:p>
+      <w:pPr>
+        <w:pStyle w:val="BodyText"/>
+        <w:numPr>
+          <w:ilvl w:val="0"/>
+          <w:numId w:val="0"/>
+        </w:numPr>
+        <w:spacing w:before="200" w:after="120"/>
+        <w:ind w:hanging="0" w:start="0"/>
+        <w:rPr>
+          <w:color w:val="000000"/>
+        </w:rPr>
+      </w:pPr>
+      <w:r>
+        <w:rPr/>
       </w:r>
     </w:p>
     <w:sectPr>
@@ -1220,6 +1342,244 @@
       <w:rPr/>
     </w:lvl>
   </w:abstractNum>
+  <w:abstractNum w:abstractNumId="5">
+    <w:lvl w:ilvl="0">
+      <w:start w:val="1"/>
+      <w:numFmt w:val="decimal"/>
+      <w:lvlText w:val="%1."/>
+      <w:lvlJc w:val="start"/>
+      <w:pPr>
+        <w:tabs>
+          <w:tab w:val="num" w:pos="720"/>
+        </w:tabs>
+        <w:ind w:start="720" w:hanging="360"/>
+      </w:pPr>
+      <w:rPr/>
+    </w:lvl>
+    <w:lvl w:ilvl="1">
+      <w:start w:val="1"/>
+      <w:numFmt w:val="decimal"/>
+      <w:lvlText w:val="%2."/>
+      <w:lvlJc w:val="start"/>
+      <w:pPr>
+        <w:tabs>
+          <w:tab w:val="num" w:pos="1080"/>
+        </w:tabs>
+        <w:ind w:start="1080" w:hanging="360"/>
+      </w:pPr>
+      <w:rPr/>
+    </w:lvl>
+    <w:lvl w:ilvl="2">
+      <w:start w:val="1"/>
+      <w:numFmt w:val="decimal"/>
+      <w:lvlText w:val="%3."/>
+      <w:lvlJc w:val="start"/>
+      <w:pPr>
+        <w:tabs>
+          <w:tab w:val="num" w:pos="1440"/>
+        </w:tabs>
+        <w:ind w:start="1440" w:hanging="360"/>
+      </w:pPr>
+      <w:rPr/>
+    </w:lvl>
+    <w:lvl w:ilvl="3">
+      <w:start w:val="1"/>
+      <w:numFmt w:val="decimal"/>
+      <w:lvlText w:val="%4."/>
+      <w:lvlJc w:val="start"/>
+      <w:pPr>
+        <w:tabs>
+          <w:tab w:val="num" w:pos="1800"/>
+        </w:tabs>
+        <w:ind w:start="1800" w:hanging="360"/>
+      </w:pPr>
+      <w:rPr/>
+    </w:lvl>
+    <w:lvl w:ilvl="4">
+      <w:start w:val="1"/>
+      <w:numFmt w:val="decimal"/>
+      <w:lvlText w:val="%5."/>
+      <w:lvlJc w:val="start"/>
+      <w:pPr>
+        <w:tabs>
+          <w:tab w:val="num" w:pos="2160"/>
+        </w:tabs>
+        <w:ind w:start="2160" w:hanging="360"/>
+      </w:pPr>
+      <w:rPr/>
+    </w:lvl>
+    <w:lvl w:ilvl="5">
+      <w:start w:val="1"/>
+      <w:numFmt w:val="decimal"/>
+      <w:lvlText w:val="%6."/>
+      <w:lvlJc w:val="start"/>
+      <w:pPr>
+        <w:tabs>
+          <w:tab w:val="num" w:pos="2520"/>
+        </w:tabs>
+        <w:ind w:start="2520" w:hanging="360"/>
+      </w:pPr>
+      <w:rPr/>
+    </w:lvl>
+    <w:lvl w:ilvl="6">
+      <w:start w:val="1"/>
+      <w:numFmt w:val="decimal"/>
+      <w:lvlText w:val="%7."/>
+      <w:lvlJc w:val="start"/>
+      <w:pPr>
+        <w:tabs>
+          <w:tab w:val="num" w:pos="2880"/>
+        </w:tabs>
+        <w:ind w:start="2880" w:hanging="360"/>
+      </w:pPr>
+      <w:rPr/>
+    </w:lvl>
+    <w:lvl w:ilvl="7">
+      <w:start w:val="1"/>
+      <w:numFmt w:val="decimal"/>
+      <w:lvlText w:val="%8."/>
+      <w:lvlJc w:val="start"/>
+      <w:pPr>
+        <w:tabs>
+          <w:tab w:val="num" w:pos="3240"/>
+        </w:tabs>
+        <w:ind w:start="3240" w:hanging="360"/>
+      </w:pPr>
+      <w:rPr/>
+    </w:lvl>
+    <w:lvl w:ilvl="8">
+      <w:start w:val="1"/>
+      <w:numFmt w:val="decimal"/>
+      <w:lvlText w:val="%9."/>
+      <w:lvlJc w:val="start"/>
+      <w:pPr>
+        <w:tabs>
+          <w:tab w:val="num" w:pos="3600"/>
+        </w:tabs>
+        <w:ind w:start="3600" w:hanging="360"/>
+      </w:pPr>
+      <w:rPr/>
+    </w:lvl>
+  </w:abstractNum>
+  <w:abstractNum w:abstractNumId="6">
+    <w:lvl w:ilvl="0">
+      <w:start w:val="1"/>
+      <w:numFmt w:val="decimal"/>
+      <w:lvlText w:val="%1."/>
+      <w:lvlJc w:val="start"/>
+      <w:pPr>
+        <w:tabs>
+          <w:tab w:val="num" w:pos="720"/>
+        </w:tabs>
+        <w:ind w:start="720" w:hanging="360"/>
+      </w:pPr>
+      <w:rPr/>
+    </w:lvl>
+    <w:lvl w:ilvl="1">
+      <w:start w:val="1"/>
+      <w:numFmt w:val="decimal"/>
+      <w:lvlText w:val="%2."/>
+      <w:lvlJc w:val="start"/>
+      <w:pPr>
+        <w:tabs>
+          <w:tab w:val="num" w:pos="1080"/>
+        </w:tabs>
+        <w:ind w:start="1080" w:hanging="360"/>
+      </w:pPr>
+      <w:rPr/>
+    </w:lvl>
+    <w:lvl w:ilvl="2">
+      <w:start w:val="1"/>
+      <w:numFmt w:val="decimal"/>
+      <w:lvlText w:val="%3."/>
+      <w:lvlJc w:val="start"/>
+      <w:pPr>
+        <w:tabs>
+          <w:tab w:val="num" w:pos="1440"/>
+        </w:tabs>
+        <w:ind w:start="1440" w:hanging="360"/>
+      </w:pPr>
+      <w:rPr/>
+    </w:lvl>
+    <w:lvl w:ilvl="3">
+      <w:start w:val="1"/>
+      <w:numFmt w:val="decimal"/>
+      <w:lvlText w:val="%4."/>
+      <w:lvlJc w:val="start"/>
+      <w:pPr>
+        <w:tabs>
+          <w:tab w:val="num" w:pos="1800"/>
+        </w:tabs>
+        <w:ind w:start="1800" w:hanging="360"/>
+      </w:pPr>
+      <w:rPr/>
+    </w:lvl>
+    <w:lvl w:ilvl="4">
+      <w:start w:val="1"/>
+      <w:numFmt w:val="decimal"/>
+      <w:lvlText w:val="%5."/>
+      <w:lvlJc w:val="start"/>
+      <w:pPr>
+        <w:tabs>
+          <w:tab w:val="num" w:pos="2160"/>
+        </w:tabs>
+        <w:ind w:start="2160" w:hanging="360"/>
+      </w:pPr>
+      <w:rPr/>
+    </w:lvl>
+    <w:lvl w:ilvl="5">
+      <w:start w:val="1"/>
+      <w:numFmt w:val="decimal"/>
+      <w:lvlText w:val="%6."/>
+      <w:lvlJc w:val="start"/>
+      <w:pPr>
+        <w:tabs>
+          <w:tab w:val="num" w:pos="2520"/>
+        </w:tabs>
+        <w:ind w:start="2520" w:hanging="360"/>
+      </w:pPr>
+      <w:rPr/>
+    </w:lvl>
+    <w:lvl w:ilvl="6">
+      <w:start w:val="1"/>
+      <w:numFmt w:val="decimal"/>
+      <w:lvlText w:val="%7."/>
+      <w:lvlJc w:val="start"/>
+      <w:pPr>
+        <w:tabs>
+          <w:tab w:val="num" w:pos="2880"/>
+        </w:tabs>
+        <w:ind w:start="2880" w:hanging="360"/>
+      </w:pPr>
+      <w:rPr/>
+    </w:lvl>
+    <w:lvl w:ilvl="7">
+      <w:start w:val="1"/>
+      <w:numFmt w:val="decimal"/>
+      <w:lvlText w:val="%8."/>
+      <w:lvlJc w:val="start"/>
+      <w:pPr>
+        <w:tabs>
+          <w:tab w:val="num" w:pos="3240"/>
+        </w:tabs>
+        <w:ind w:start="3240" w:hanging="360"/>
+      </w:pPr>
+      <w:rPr/>
+    </w:lvl>
+    <w:lvl w:ilvl="8">
+      <w:start w:val="1"/>
+      <w:numFmt w:val="decimal"/>
+      <w:lvlText w:val="%9."/>
+      <w:lvlJc w:val="start"/>
+      <w:pPr>
+        <w:tabs>
+          <w:tab w:val="num" w:pos="3600"/>
+        </w:tabs>
+        <w:ind w:start="3600" w:hanging="360"/>
+      </w:pPr>
+      <w:rPr/>
+    </w:lvl>
+  </w:abstractNum>
   <w:num w:numId="1">
     <w:abstractNumId w:val="1"/>
   </w:num>
@@ -1231,6 +1591,12 @@
   </w:num>
   <w:num w:numId="4">
     <w:abstractNumId w:val="4"/>
+  </w:num>
+  <w:num w:numId="5">
+    <w:abstractNumId w:val="5"/>
+  </w:num>
+  <w:num w:numId="6">
+    <w:abstractNumId w:val="6"/>
   </w:num>
 </w:numbering>
 </file>
@@ -1672,8 +2038,8 @@
     <w:qFormat/>
     <w:rPr/>
   </w:style>
-  <w:style w:type="character" w:styleId="Bullets">
-    <w:name w:val="Bullets"/>
+  <w:style w:type="character" w:styleId="Bulletsuser">
+    <w:name w:val="Bullets (user)"/>
     <w:qFormat/>
     <w:rPr>
       <w:rFonts w:ascii="OpenSymbol" w:hAnsi="OpenSymbol" w:eastAsia="OpenSymbol" w:cs="OpenSymbol"/>
@@ -1683,6 +2049,14 @@
     <w:name w:val="Numbering Symbols"/>
     <w:qFormat/>
     <w:rPr/>
+  </w:style>
+  <w:style w:type="character" w:styleId="Strong">
+    <w:name w:val="Strong"/>
+    <w:qFormat/>
+    <w:rPr>
+      <w:b/>
+      <w:bCs/>
+    </w:rPr>
   </w:style>
   <w:style w:type="paragraph" w:styleId="Heading">
     <w:name w:val="Heading"/>

</xml_diff>